<commit_message>
feat: Added full engineering log for ahmad-ai
</commit_message>
<xml_diff>
--- a/Muhammad_Ahmad_Updated_CV_2026.docx
+++ b/Muhammad_Ahmad_Updated_CV_2026.docx
@@ -11,7 +11,6 @@
           <w:szCs w:val="56"/>
         </w:rPr>
       </w:pPr>
-      <w:bookmarkStart w:id="0" w:name="_GoBack"/>
       <w:r>
         <w:rPr>
           <w:rFonts w:asciiTheme="majorBidi" w:hAnsiTheme="majorBidi" w:cstheme="majorBidi"/>
@@ -24,6 +23,102 @@
     <w:p>
       <w:pPr>
         <w:spacing w:line="240" w:lineRule="auto"/>
+      </w:pPr>
+      <w:r>
+        <w:t>AI Agent Engineer | Digital Supply Chain Systems Architect | PMP®, RMP®</w:t>
+      </w:r>
+    </w:p>
+    <w:p>
+      <w:pPr>
+        <w:spacing w:line="240" w:lineRule="auto"/>
+        <w:rPr>
+          <w:rFonts w:asciiTheme="majorBidi" w:hAnsiTheme="majorBidi" w:cstheme="majorBidi"/>
+        </w:rPr>
+      </w:pPr>
+      <w:r>
+        <w:t>MSc Operations &amp; Supply Chain Management | 15+ Years Building Scalable Operations, Automation &amp; AI Agent Systems | Lahore, Pakistan (Open to Global &amp; Remote)</w:t>
+      </w:r>
+      <w:r>
+        <w:t xml:space="preserve"> </w:t>
+      </w:r>
+      <w:r>
+        <w:rPr>
+          <w:rFonts w:asciiTheme="majorBidi" w:hAnsiTheme="majorBidi" w:cstheme="majorBidi"/>
+        </w:rPr>
+        <w:t>+923095222202 | muhammad.a.ahmed@gmail.com | linkedin.com/in/</w:t>
+      </w:r>
+      <w:proofErr w:type="spellStart"/>
+      <w:r>
+        <w:rPr>
+          <w:rFonts w:asciiTheme="majorBidi" w:hAnsiTheme="majorBidi" w:cstheme="majorBidi"/>
+        </w:rPr>
+        <w:t>muhammadahmadscm</w:t>
+      </w:r>
+      <w:proofErr w:type="spellEnd"/>
+      <w:r>
+        <w:rPr>
+          <w:rFonts w:asciiTheme="majorBidi" w:hAnsiTheme="majorBidi" w:cstheme="majorBidi"/>
+        </w:rPr>
+        <w:t xml:space="preserve">  </w:t>
+      </w:r>
+    </w:p>
+    <w:p>
+      <w:pPr>
+        <w:spacing w:line="240" w:lineRule="auto"/>
+        <w:rPr>
+          <w:rFonts w:asciiTheme="majorBidi" w:hAnsiTheme="majorBidi" w:cstheme="majorBidi"/>
+        </w:rPr>
+      </w:pPr>
+      <w:r>
+        <w:rPr>
+          <w:rFonts w:asciiTheme="majorBidi" w:hAnsiTheme="majorBidi" w:cstheme="majorBidi"/>
+        </w:rPr>
+        <w:t>GrowEasy: groweasycloud.github.io/</w:t>
+      </w:r>
+      <w:proofErr w:type="spellStart"/>
+      <w:r>
+        <w:rPr>
+          <w:rFonts w:asciiTheme="majorBidi" w:hAnsiTheme="majorBidi" w:cstheme="majorBidi"/>
+        </w:rPr>
+        <w:t>groweasysite</w:t>
+      </w:r>
+      <w:proofErr w:type="spellEnd"/>
+      <w:r>
+        <w:rPr>
+          <w:rFonts w:asciiTheme="majorBidi" w:hAnsiTheme="majorBidi" w:cstheme="majorBidi"/>
+        </w:rPr>
+        <w:t xml:space="preserve">  </w:t>
+      </w:r>
+      <w:r>
+        <w:rPr>
+          <w:rFonts w:asciiTheme="majorBidi" w:hAnsiTheme="majorBidi" w:cstheme="majorBidi"/>
+        </w:rPr>
+        <w:t xml:space="preserve"> </w:t>
+      </w:r>
+      <w:r>
+        <w:rPr>
+          <w:rFonts w:asciiTheme="majorBidi" w:hAnsiTheme="majorBidi" w:cstheme="majorBidi"/>
+        </w:rPr>
+        <w:t>Portfolio: emadaed.github.io/</w:t>
+      </w:r>
+      <w:proofErr w:type="spellStart"/>
+      <w:r>
+        <w:rPr>
+          <w:rFonts w:asciiTheme="majorBidi" w:hAnsiTheme="majorBidi" w:cstheme="majorBidi"/>
+        </w:rPr>
+        <w:t>digisuite</w:t>
+      </w:r>
+      <w:proofErr w:type="spellEnd"/>
+      <w:r>
+        <w:rPr>
+          <w:rFonts w:asciiTheme="majorBidi" w:hAnsiTheme="majorBidi" w:cstheme="majorBidi"/>
+        </w:rPr>
+        <w:t xml:space="preserve">  </w:t>
+      </w:r>
+    </w:p>
+    <w:p>
+      <w:pPr>
+        <w:spacing w:line="240" w:lineRule="auto"/>
         <w:rPr>
           <w:rFonts w:asciiTheme="majorBidi" w:hAnsiTheme="majorBidi" w:cstheme="majorBidi"/>
           <w:b/>
@@ -40,9 +135,20 @@
           <w:sz w:val="28"/>
           <w:szCs w:val="28"/>
         </w:rPr>
-        <w:t xml:space="preserve">Digital </w:t>
-      </w:r>
-      <w:r>
+        <w:t>Professional Summary</w:t>
+      </w:r>
+    </w:p>
+    <w:p>
+      <w:pPr>
+        <w:spacing w:line="240" w:lineRule="auto"/>
+      </w:pPr>
+      <w:r>
+        <w:t>Supply Chain Systems Architect turned AI Agent Engineer, with 15+ years building and optimizing complex operations in telecom and logistics, now applying that same operational rigor to production-grade AI agents. Founded operational frameworks for one of Ericsson's largest managed services contracts in KSA while personally developing and shipping production software — including GrowEasy (SaaS ERP), a custom WMS, an LMS, and Ahmad-AI, a local AI agent engineered with deterministic hallucination guardrails and a 22-test regression suite. PMP® and RMP® certified. Open to global and remote roles in Agentic AI Engineering and Supply Chain Digital Transformation.</w:t>
+      </w:r>
+    </w:p>
+    <w:p>
+      <w:pPr>
+        <w:spacing w:line="240" w:lineRule="auto"/>
         <w:rPr>
           <w:rFonts w:asciiTheme="majorBidi" w:hAnsiTheme="majorBidi" w:cstheme="majorBidi"/>
           <w:b/>
@@ -50,92 +156,10 @@
           <w:sz w:val="28"/>
           <w:szCs w:val="28"/>
         </w:rPr>
-        <w:t xml:space="preserve">Supply Chain Systems &amp; Automation Architect | PMP®, RMP®  </w:t>
-      </w:r>
-    </w:p>
-    <w:p>
-      <w:pPr>
-        <w:spacing w:line="240" w:lineRule="auto"/>
-        <w:rPr>
-          <w:rFonts w:asciiTheme="majorBidi" w:hAnsiTheme="majorBidi" w:cstheme="majorBidi"/>
-        </w:rPr>
-      </w:pPr>
-      <w:r>
-        <w:rPr>
-          <w:rFonts w:asciiTheme="majorBidi" w:hAnsiTheme="majorBidi" w:cstheme="majorBidi"/>
-        </w:rPr>
-        <w:t xml:space="preserve">MSc Operations &amp; Supply Chain Management | 15+ Years Building Scalable Operations &amp; Business Automation Systems | Lahore, Pakistan (Open to Global &amp; Remote)  </w:t>
-      </w:r>
-    </w:p>
-    <w:p>
-      <w:pPr>
-        <w:spacing w:line="240" w:lineRule="auto"/>
-        <w:rPr>
-          <w:rFonts w:asciiTheme="majorBidi" w:hAnsiTheme="majorBidi" w:cstheme="majorBidi"/>
-          <w:lang w:val="de-DE"/>
-        </w:rPr>
-      </w:pPr>
-      <w:r>
-        <w:rPr>
-          <w:rFonts w:asciiTheme="majorBidi" w:hAnsiTheme="majorBidi" w:cstheme="majorBidi"/>
-          <w:lang w:val="de-DE"/>
-        </w:rPr>
-        <w:t xml:space="preserve">+923095222202 | muhammad.a.ahmed@gmail.com | linkedin.com/in/muhammadahmadscm  </w:t>
-      </w:r>
-    </w:p>
-    <w:p>
-      <w:pPr>
-        <w:spacing w:line="240" w:lineRule="auto"/>
-        <w:rPr>
-          <w:rFonts w:asciiTheme="majorBidi" w:hAnsiTheme="majorBidi" w:cstheme="majorBidi"/>
-        </w:rPr>
-      </w:pPr>
-      <w:r>
-        <w:rPr>
-          <w:rFonts w:asciiTheme="majorBidi" w:hAnsiTheme="majorBidi" w:cstheme="majorBidi"/>
-        </w:rPr>
-        <w:t>GrowEasy: groweasycloud.github.io/</w:t>
-      </w:r>
-      <w:proofErr w:type="spellStart"/>
-      <w:proofErr w:type="gramStart"/>
-      <w:r>
-        <w:rPr>
-          <w:rFonts w:asciiTheme="majorBidi" w:hAnsiTheme="majorBidi" w:cstheme="majorBidi"/>
-        </w:rPr>
-        <w:t>groweasysite</w:t>
-      </w:r>
-      <w:proofErr w:type="spellEnd"/>
-      <w:r>
-        <w:rPr>
-          <w:rFonts w:asciiTheme="majorBidi" w:hAnsiTheme="majorBidi" w:cstheme="majorBidi"/>
-        </w:rPr>
-        <w:t xml:space="preserve">  Portfolio</w:t>
-      </w:r>
-      <w:proofErr w:type="gramEnd"/>
-      <w:r>
-        <w:rPr>
-          <w:rFonts w:asciiTheme="majorBidi" w:hAnsiTheme="majorBidi" w:cstheme="majorBidi"/>
-        </w:rPr>
-        <w:t>: emadaed.github.io/</w:t>
-      </w:r>
-      <w:proofErr w:type="spellStart"/>
-      <w:r>
-        <w:rPr>
-          <w:rFonts w:asciiTheme="majorBidi" w:hAnsiTheme="majorBidi" w:cstheme="majorBidi"/>
-        </w:rPr>
-        <w:t>digisuite</w:t>
-      </w:r>
-      <w:proofErr w:type="spellEnd"/>
-      <w:r>
-        <w:rPr>
-          <w:rFonts w:asciiTheme="majorBidi" w:hAnsiTheme="majorBidi" w:cstheme="majorBidi"/>
-        </w:rPr>
-        <w:t xml:space="preserve">  </w:t>
-      </w:r>
-    </w:p>
-    <w:p>
-      <w:pPr>
-        <w:spacing w:line="240" w:lineRule="auto"/>
+      </w:pPr>
+      <w:bookmarkStart w:id="0" w:name="_GoBack"/>
+      <w:bookmarkEnd w:id="0"/>
+      <w:r>
         <w:rPr>
           <w:rFonts w:asciiTheme="majorBidi" w:hAnsiTheme="majorBidi" w:cstheme="majorBidi"/>
           <w:b/>
@@ -143,8 +167,138 @@
           <w:sz w:val="28"/>
           <w:szCs w:val="28"/>
         </w:rPr>
-      </w:pPr>
-      <w:r>
+        <w:t>Core Competencies</w:t>
+      </w:r>
+    </w:p>
+    <w:p>
+      <w:pPr>
+        <w:spacing w:line="240" w:lineRule="auto"/>
+        <w:rPr>
+          <w:rFonts w:asciiTheme="majorBidi" w:hAnsiTheme="majorBidi" w:cstheme="majorBidi"/>
+        </w:rPr>
+      </w:pPr>
+      <w:r>
+        <w:rPr>
+          <w:rFonts w:asciiTheme="majorBidi" w:hAnsiTheme="majorBidi" w:cstheme="majorBidi"/>
+        </w:rPr>
+        <w:t xml:space="preserve"> Supply Chain Strategy &amp; Operations Automation  </w:t>
+      </w:r>
+    </w:p>
+    <w:p>
+      <w:pPr>
+        <w:spacing w:line="240" w:lineRule="auto"/>
+        <w:rPr>
+          <w:rFonts w:asciiTheme="majorBidi" w:hAnsiTheme="majorBidi" w:cstheme="majorBidi"/>
+        </w:rPr>
+      </w:pPr>
+      <w:r>
+        <w:rPr>
+          <w:rFonts w:asciiTheme="majorBidi" w:hAnsiTheme="majorBidi" w:cstheme="majorBidi"/>
+        </w:rPr>
+        <w:t xml:space="preserve"> ERP &amp; WMS Enablement (SAP WM, Sage 100, Odoo)  </w:t>
+      </w:r>
+    </w:p>
+    <w:p>
+      <w:pPr>
+        <w:spacing w:line="240" w:lineRule="auto"/>
+        <w:rPr>
+          <w:rFonts w:asciiTheme="majorBidi" w:hAnsiTheme="majorBidi" w:cstheme="majorBidi"/>
+        </w:rPr>
+      </w:pPr>
+      <w:r>
+        <w:rPr>
+          <w:rFonts w:asciiTheme="majorBidi" w:hAnsiTheme="majorBidi" w:cstheme="majorBidi"/>
+        </w:rPr>
+        <w:t xml:space="preserve"> Process Digitization &amp; Workflow Engineering (Python, Flask, </w:t>
+      </w:r>
+      <w:proofErr w:type="gramStart"/>
+      <w:r>
+        <w:rPr>
+          <w:rFonts w:asciiTheme="majorBidi" w:hAnsiTheme="majorBidi" w:cstheme="majorBidi"/>
+        </w:rPr>
+        <w:t>SQL</w:t>
+      </w:r>
+      <w:proofErr w:type="gramEnd"/>
+      <w:r>
+        <w:rPr>
+          <w:rFonts w:asciiTheme="majorBidi" w:hAnsiTheme="majorBidi" w:cstheme="majorBidi"/>
+        </w:rPr>
+        <w:t xml:space="preserve">)  </w:t>
+      </w:r>
+    </w:p>
+    <w:p>
+      <w:pPr>
+        <w:spacing w:line="240" w:lineRule="auto"/>
+        <w:rPr>
+          <w:rFonts w:asciiTheme="majorBidi" w:hAnsiTheme="majorBidi" w:cstheme="majorBidi"/>
+        </w:rPr>
+      </w:pPr>
+      <w:r>
+        <w:rPr>
+          <w:rFonts w:asciiTheme="majorBidi" w:hAnsiTheme="majorBidi" w:cstheme="majorBidi"/>
+        </w:rPr>
+        <w:t xml:space="preserve"> Risk Management &amp; Mitigation (RMP®)  </w:t>
+      </w:r>
+    </w:p>
+    <w:p>
+      <w:pPr>
+        <w:spacing w:line="240" w:lineRule="auto"/>
+        <w:rPr>
+          <w:rFonts w:asciiTheme="majorBidi" w:hAnsiTheme="majorBidi" w:cstheme="majorBidi"/>
+        </w:rPr>
+      </w:pPr>
+      <w:r>
+        <w:rPr>
+          <w:rFonts w:asciiTheme="majorBidi" w:hAnsiTheme="majorBidi" w:cstheme="majorBidi"/>
+        </w:rPr>
+        <w:t xml:space="preserve"> Project &amp; Program Management (PMP®)  </w:t>
+      </w:r>
+    </w:p>
+    <w:p>
+      <w:pPr>
+        <w:spacing w:line="240" w:lineRule="auto"/>
+        <w:rPr>
+          <w:rFonts w:asciiTheme="majorBidi" w:hAnsiTheme="majorBidi" w:cstheme="majorBidi"/>
+        </w:rPr>
+      </w:pPr>
+      <w:r>
+        <w:rPr>
+          <w:rFonts w:asciiTheme="majorBidi" w:hAnsiTheme="majorBidi" w:cstheme="majorBidi"/>
+        </w:rPr>
+        <w:t xml:space="preserve"> Vendor &amp; SLA/WLA Governance  </w:t>
+      </w:r>
+    </w:p>
+    <w:p>
+      <w:pPr>
+        <w:spacing w:line="240" w:lineRule="auto"/>
+        <w:rPr>
+          <w:rFonts w:asciiTheme="majorBidi" w:hAnsiTheme="majorBidi" w:cstheme="majorBidi"/>
+        </w:rPr>
+      </w:pPr>
+      <w:r>
+        <w:rPr>
+          <w:rFonts w:asciiTheme="majorBidi" w:hAnsiTheme="majorBidi" w:cstheme="majorBidi"/>
+        </w:rPr>
+        <w:t xml:space="preserve"> Warehouse &amp; Inventory Process Improvement  </w:t>
+      </w:r>
+    </w:p>
+    <w:p>
+      <w:pPr>
+        <w:spacing w:line="240" w:lineRule="auto"/>
+        <w:rPr>
+          <w:rFonts w:asciiTheme="majorBidi" w:hAnsiTheme="majorBidi" w:cstheme="majorBidi"/>
+        </w:rPr>
+      </w:pPr>
+      <w:r>
+        <w:rPr>
+          <w:rFonts w:asciiTheme="majorBidi" w:hAnsiTheme="majorBidi" w:cstheme="majorBidi"/>
+        </w:rPr>
+        <w:t xml:space="preserve"> Business Systems &amp; Process Optimization  </w:t>
+      </w:r>
+    </w:p>
+    <w:p>
+      <w:pPr>
+        <w:spacing w:line="240" w:lineRule="auto"/>
         <w:rPr>
           <w:rFonts w:asciiTheme="majorBidi" w:hAnsiTheme="majorBidi" w:cstheme="majorBidi"/>
           <w:b/>
@@ -152,39 +306,8 @@
           <w:sz w:val="28"/>
           <w:szCs w:val="28"/>
         </w:rPr>
-        <w:t>Professional Summary</w:t>
-      </w:r>
-    </w:p>
-    <w:p>
-      <w:pPr>
-        <w:spacing w:line="240" w:lineRule="auto"/>
-        <w:rPr>
-          <w:rFonts w:asciiTheme="majorBidi" w:hAnsiTheme="majorBidi" w:cstheme="majorBidi"/>
-        </w:rPr>
-      </w:pPr>
-      <w:r>
-        <w:rPr>
-          <w:rFonts w:asciiTheme="majorBidi" w:hAnsiTheme="majorBidi" w:cstheme="majorBidi"/>
-        </w:rPr>
-        <w:t>Supply Chain Systems &amp; Automation Architect with 15+ years building and optimizing complex operations in telecom and logistics. Founded operational frameworks for one of Ericsson’s largest managed services contracts in KSA while personally developing and shipping production softw</w:t>
-      </w:r>
-      <w:r>
-        <w:rPr>
-          <w:rFonts w:asciiTheme="majorBidi" w:hAnsiTheme="majorBidi" w:cstheme="majorBidi"/>
-        </w:rPr>
-        <w:t>are systems (SaaS ERP, Custom Warehouse Management System (WMS), and Learning Management System (LMS</w:t>
-      </w:r>
-      <w:r>
-        <w:rPr>
-          <w:rFonts w:asciiTheme="majorBidi" w:hAnsiTheme="majorBidi" w:cstheme="majorBidi"/>
-        </w:rPr>
-        <w:t>) that deliver measurable efficiency gains. PMP® and RMP® certified. Open to global and remote roles in Supply Chain Digital Transformation, Operations Technology, and Automation leadership.</w:t>
-      </w:r>
-    </w:p>
-    <w:bookmarkEnd w:id="0"/>
-    <w:p>
-      <w:pPr>
-        <w:spacing w:line="240" w:lineRule="auto"/>
+      </w:pPr>
+      <w:r>
         <w:rPr>
           <w:rFonts w:asciiTheme="majorBidi" w:hAnsiTheme="majorBidi" w:cstheme="majorBidi"/>
           <w:b/>
@@ -192,8 +315,253 @@
           <w:sz w:val="28"/>
           <w:szCs w:val="28"/>
         </w:rPr>
-      </w:pPr>
-      <w:r>
+        <w:t>Professional Experience</w:t>
+      </w:r>
+    </w:p>
+    <w:p>
+      <w:pPr>
+        <w:spacing w:line="240" w:lineRule="auto"/>
+        <w:rPr>
+          <w:rFonts w:asciiTheme="majorBidi" w:hAnsiTheme="majorBidi" w:cstheme="majorBidi"/>
+          <w:b/>
+          <w:bCs/>
+          <w:sz w:val="24"/>
+          <w:szCs w:val="24"/>
+        </w:rPr>
+      </w:pPr>
+      <w:r>
+        <w:rPr>
+          <w:rFonts w:asciiTheme="majorBidi" w:hAnsiTheme="majorBidi" w:cstheme="majorBidi"/>
+          <w:b/>
+          <w:bCs/>
+          <w:sz w:val="24"/>
+          <w:szCs w:val="24"/>
+        </w:rPr>
+        <w:t xml:space="preserve">Supply Chain Manager  </w:t>
+      </w:r>
+    </w:p>
+    <w:p>
+      <w:pPr>
+        <w:spacing w:line="240" w:lineRule="auto"/>
+        <w:rPr>
+          <w:rFonts w:asciiTheme="majorBidi" w:hAnsiTheme="majorBidi" w:cstheme="majorBidi"/>
+          <w:sz w:val="24"/>
+          <w:szCs w:val="24"/>
+        </w:rPr>
+      </w:pPr>
+      <w:r>
+        <w:rPr>
+          <w:rFonts w:asciiTheme="majorBidi" w:hAnsiTheme="majorBidi" w:cstheme="majorBidi"/>
+          <w:sz w:val="24"/>
+          <w:szCs w:val="24"/>
+        </w:rPr>
+        <w:t xml:space="preserve">Blue Light LLC | Lahore, Pakistan — November 2022 – May 2026  </w:t>
+      </w:r>
+    </w:p>
+    <w:p>
+      <w:pPr>
+        <w:spacing w:after="0" w:line="240" w:lineRule="auto"/>
+        <w:rPr>
+          <w:rFonts w:asciiTheme="majorBidi" w:eastAsia="Times New Roman" w:hAnsiTheme="majorBidi" w:cstheme="majorBidi"/>
+        </w:rPr>
+      </w:pPr>
+      <w:r>
+        <w:rPr>
+          <w:rFonts w:asciiTheme="majorBidi" w:eastAsia="Times New Roman" w:hAnsiTheme="majorBidi" w:cstheme="majorBidi"/>
+          <w:b/>
+          <w:bCs/>
+        </w:rPr>
+        <w:t>Transformed</w:t>
+      </w:r>
+      <w:r>
+        <w:rPr>
+          <w:rFonts w:asciiTheme="majorBidi" w:eastAsia="Times New Roman" w:hAnsiTheme="majorBidi" w:cstheme="majorBidi"/>
+        </w:rPr>
+        <w:t xml:space="preserve"> a manual, fragmented supply chain into a fully documented, scalable operation, establishing the company’s first end-to-end operational playbook. </w:t>
+      </w:r>
+    </w:p>
+    <w:p>
+      <w:pPr>
+        <w:spacing w:after="0" w:line="240" w:lineRule="auto"/>
+        <w:rPr>
+          <w:rFonts w:asciiTheme="majorBidi" w:eastAsia="Times New Roman" w:hAnsiTheme="majorBidi" w:cstheme="majorBidi"/>
+        </w:rPr>
+      </w:pPr>
+      <w:r>
+        <w:rPr>
+          <w:rFonts w:asciiTheme="majorBidi" w:eastAsia="Times New Roman" w:hAnsiTheme="majorBidi" w:cstheme="majorBidi"/>
+          <w:b/>
+          <w:bCs/>
+        </w:rPr>
+        <w:t>Achieved 50% reduction</w:t>
+      </w:r>
+      <w:r>
+        <w:rPr>
+          <w:rFonts w:asciiTheme="majorBidi" w:eastAsia="Times New Roman" w:hAnsiTheme="majorBidi" w:cstheme="majorBidi"/>
+        </w:rPr>
+        <w:t xml:space="preserve"> in average delivery cycle time and </w:t>
+      </w:r>
+      <w:r>
+        <w:rPr>
+          <w:rFonts w:asciiTheme="majorBidi" w:eastAsia="Times New Roman" w:hAnsiTheme="majorBidi" w:cstheme="majorBidi"/>
+          <w:b/>
+          <w:bCs/>
+        </w:rPr>
+        <w:t>20% cost savings</w:t>
+      </w:r>
+      <w:r>
+        <w:rPr>
+          <w:rFonts w:asciiTheme="majorBidi" w:eastAsia="Times New Roman" w:hAnsiTheme="majorBidi" w:cstheme="majorBidi"/>
+        </w:rPr>
+        <w:t xml:space="preserve"> per shipment by redesigning FedEx logistics workflows, renegotiating carrier contracts, and implementing route optimization. </w:t>
+      </w:r>
+    </w:p>
+    <w:p>
+      <w:pPr>
+        <w:spacing w:after="0" w:line="240" w:lineRule="auto"/>
+        <w:rPr>
+          <w:rFonts w:asciiTheme="majorBidi" w:eastAsia="Times New Roman" w:hAnsiTheme="majorBidi" w:cstheme="majorBidi"/>
+        </w:rPr>
+      </w:pPr>
+      <w:r>
+        <w:rPr>
+          <w:rFonts w:asciiTheme="majorBidi" w:eastAsia="Times New Roman" w:hAnsiTheme="majorBidi" w:cstheme="majorBidi"/>
+          <w:b/>
+          <w:bCs/>
+        </w:rPr>
+        <w:t>Drove customer claims down</w:t>
+      </w:r>
+      <w:r>
+        <w:rPr>
+          <w:rFonts w:asciiTheme="majorBidi" w:eastAsia="Times New Roman" w:hAnsiTheme="majorBidi" w:cstheme="majorBidi"/>
+        </w:rPr>
+        <w:t xml:space="preserve"> from multiple per quarter to ~1 per quarter through systematic compliance tracking, root-cause analysis, and proactive resolution frameworks. </w:t>
+      </w:r>
+    </w:p>
+    <w:p>
+      <w:pPr>
+        <w:spacing w:after="0" w:line="240" w:lineRule="auto"/>
+        <w:rPr>
+          <w:rFonts w:asciiTheme="majorBidi" w:eastAsia="Times New Roman" w:hAnsiTheme="majorBidi" w:cstheme="majorBidi"/>
+        </w:rPr>
+      </w:pPr>
+      <w:r>
+        <w:rPr>
+          <w:rFonts w:asciiTheme="majorBidi" w:eastAsia="Times New Roman" w:hAnsiTheme="majorBidi" w:cstheme="majorBidi"/>
+          <w:b/>
+          <w:bCs/>
+        </w:rPr>
+        <w:t>Architected and deployed</w:t>
+      </w:r>
+      <w:r>
+        <w:rPr>
+          <w:rFonts w:asciiTheme="majorBidi" w:eastAsia="Times New Roman" w:hAnsiTheme="majorBidi" w:cstheme="majorBidi"/>
+        </w:rPr>
+        <w:t xml:space="preserve"> a custom Google Sheets-based WMS with automated order-to-cash workflows (invoicing, packing slips, shipping labels, and email notifications). </w:t>
+      </w:r>
+    </w:p>
+    <w:p>
+      <w:pPr>
+        <w:spacing w:after="0" w:line="240" w:lineRule="auto"/>
+        <w:rPr>
+          <w:rFonts w:asciiTheme="majorBidi" w:eastAsia="Times New Roman" w:hAnsiTheme="majorBidi" w:cstheme="majorBidi"/>
+        </w:rPr>
+      </w:pPr>
+      <w:r>
+        <w:rPr>
+          <w:rFonts w:asciiTheme="majorBidi" w:eastAsia="Times New Roman" w:hAnsiTheme="majorBidi" w:cstheme="majorBidi"/>
+          <w:b/>
+          <w:bCs/>
+        </w:rPr>
+        <w:lastRenderedPageBreak/>
+        <w:t>Designed supplier scorecards</w:t>
+      </w:r>
+      <w:r>
+        <w:rPr>
+          <w:rFonts w:asciiTheme="majorBidi" w:eastAsia="Times New Roman" w:hAnsiTheme="majorBidi" w:cstheme="majorBidi"/>
+        </w:rPr>
+        <w:t xml:space="preserve"> and demand-driven reorder planning that eliminated chronic stock-outs and significantly improved OTIF (On-Time In-Full) performance. </w:t>
+      </w:r>
+    </w:p>
+    <w:p>
+      <w:pPr>
+        <w:spacing w:line="240" w:lineRule="auto"/>
+        <w:rPr>
+          <w:rFonts w:asciiTheme="majorBidi" w:eastAsia="Times New Roman" w:hAnsiTheme="majorBidi" w:cstheme="majorBidi"/>
+        </w:rPr>
+      </w:pPr>
+      <w:r>
+        <w:rPr>
+          <w:rFonts w:asciiTheme="majorBidi" w:eastAsia="Times New Roman" w:hAnsiTheme="majorBidi" w:cstheme="majorBidi"/>
+          <w:b/>
+          <w:bCs/>
+        </w:rPr>
+        <w:t>Managed full supply chain P&amp;L</w:t>
+      </w:r>
+      <w:r>
+        <w:rPr>
+          <w:rFonts w:asciiTheme="majorBidi" w:eastAsia="Times New Roman" w:hAnsiTheme="majorBidi" w:cstheme="majorBidi"/>
+        </w:rPr>
+        <w:t xml:space="preserve">, including </w:t>
+      </w:r>
+      <w:r>
+        <w:rPr>
+          <w:rFonts w:asciiTheme="majorBidi" w:eastAsia="Times New Roman" w:hAnsiTheme="majorBidi" w:cstheme="majorBidi"/>
+        </w:rPr>
+        <w:t>10M</w:t>
+      </w:r>
+      <w:r>
+        <w:rPr>
+          <w:rFonts w:asciiTheme="majorBidi" w:eastAsia="Times New Roman" w:hAnsiTheme="majorBidi" w:cstheme="majorBidi"/>
+        </w:rPr>
+        <w:t>+</w:t>
+      </w:r>
+      <w:r>
+        <w:rPr>
+          <w:rFonts w:asciiTheme="majorBidi" w:eastAsia="Times New Roman" w:hAnsiTheme="majorBidi" w:cstheme="majorBidi"/>
+        </w:rPr>
+        <w:t xml:space="preserve"> Logistics and Procurement budget</w:t>
+      </w:r>
+      <w:r>
+        <w:rPr>
+          <w:rFonts w:asciiTheme="majorBidi" w:eastAsia="Times New Roman" w:hAnsiTheme="majorBidi" w:cstheme="majorBidi"/>
+        </w:rPr>
+        <w:t xml:space="preserve"> - leading</w:t>
+      </w:r>
+      <w:r>
+        <w:rPr>
+          <w:rFonts w:asciiTheme="majorBidi" w:eastAsia="Times New Roman" w:hAnsiTheme="majorBidi" w:cstheme="majorBidi"/>
+        </w:rPr>
+        <w:t xml:space="preserve"> </w:t>
+      </w:r>
+      <w:r>
+        <w:rPr>
+          <w:rFonts w:asciiTheme="majorBidi" w:eastAsia="Times New Roman" w:hAnsiTheme="majorBidi" w:cstheme="majorBidi"/>
+        </w:rPr>
+        <w:t xml:space="preserve">vendor negotiations </w:t>
+      </w:r>
+      <w:r>
+        <w:rPr>
+          <w:rFonts w:asciiTheme="majorBidi" w:eastAsia="Times New Roman" w:hAnsiTheme="majorBidi" w:cstheme="majorBidi"/>
+        </w:rPr>
+        <w:t>and cro</w:t>
+      </w:r>
+      <w:r>
+        <w:rPr>
+          <w:rFonts w:asciiTheme="majorBidi" w:eastAsia="Times New Roman" w:hAnsiTheme="majorBidi" w:cstheme="majorBidi"/>
+        </w:rPr>
+        <w:t>ss-functional team development -</w:t>
+      </w:r>
+      <w:r>
+        <w:rPr>
+          <w:rFonts w:asciiTheme="majorBidi" w:eastAsia="Times New Roman" w:hAnsiTheme="majorBidi" w:cstheme="majorBidi"/>
+        </w:rPr>
+        <w:t xml:space="preserve"> consistently meeting cost and service KPIs.</w:t>
+      </w:r>
+    </w:p>
+    <w:p>
+      <w:pPr>
+        <w:spacing w:line="240" w:lineRule="auto"/>
         <w:rPr>
           <w:rFonts w:asciiTheme="majorBidi" w:hAnsiTheme="majorBidi" w:cstheme="majorBidi"/>
           <w:b/>
@@ -201,138 +569,8 @@
           <w:sz w:val="28"/>
           <w:szCs w:val="28"/>
         </w:rPr>
-        <w:t>Core Competencies</w:t>
-      </w:r>
-    </w:p>
-    <w:p>
-      <w:pPr>
-        <w:spacing w:line="240" w:lineRule="auto"/>
-        <w:rPr>
-          <w:rFonts w:asciiTheme="majorBidi" w:hAnsiTheme="majorBidi" w:cstheme="majorBidi"/>
-        </w:rPr>
-      </w:pPr>
-      <w:r>
-        <w:rPr>
-          <w:rFonts w:asciiTheme="majorBidi" w:hAnsiTheme="majorBidi" w:cstheme="majorBidi"/>
-        </w:rPr>
-        <w:t xml:space="preserve"> Supply Chain Strategy &amp; Operations Automation  </w:t>
-      </w:r>
-    </w:p>
-    <w:p>
-      <w:pPr>
-        <w:spacing w:line="240" w:lineRule="auto"/>
-        <w:rPr>
-          <w:rFonts w:asciiTheme="majorBidi" w:hAnsiTheme="majorBidi" w:cstheme="majorBidi"/>
-        </w:rPr>
-      </w:pPr>
-      <w:r>
-        <w:rPr>
-          <w:rFonts w:asciiTheme="majorBidi" w:hAnsiTheme="majorBidi" w:cstheme="majorBidi"/>
-        </w:rPr>
-        <w:t xml:space="preserve"> ERP &amp; WMS Enablement (SAP WM, Sage 100, Odoo)  </w:t>
-      </w:r>
-    </w:p>
-    <w:p>
-      <w:pPr>
-        <w:spacing w:line="240" w:lineRule="auto"/>
-        <w:rPr>
-          <w:rFonts w:asciiTheme="majorBidi" w:hAnsiTheme="majorBidi" w:cstheme="majorBidi"/>
-        </w:rPr>
-      </w:pPr>
-      <w:r>
-        <w:rPr>
-          <w:rFonts w:asciiTheme="majorBidi" w:hAnsiTheme="majorBidi" w:cstheme="majorBidi"/>
-        </w:rPr>
-        <w:t xml:space="preserve"> Process Digitization &amp; Workflow Engineering (Python, Flask, </w:t>
-      </w:r>
-      <w:proofErr w:type="gramStart"/>
-      <w:r>
-        <w:rPr>
-          <w:rFonts w:asciiTheme="majorBidi" w:hAnsiTheme="majorBidi" w:cstheme="majorBidi"/>
-        </w:rPr>
-        <w:t>SQL</w:t>
-      </w:r>
-      <w:proofErr w:type="gramEnd"/>
-      <w:r>
-        <w:rPr>
-          <w:rFonts w:asciiTheme="majorBidi" w:hAnsiTheme="majorBidi" w:cstheme="majorBidi"/>
-        </w:rPr>
-        <w:t xml:space="preserve">)  </w:t>
-      </w:r>
-    </w:p>
-    <w:p>
-      <w:pPr>
-        <w:spacing w:line="240" w:lineRule="auto"/>
-        <w:rPr>
-          <w:rFonts w:asciiTheme="majorBidi" w:hAnsiTheme="majorBidi" w:cstheme="majorBidi"/>
-        </w:rPr>
-      </w:pPr>
-      <w:r>
-        <w:rPr>
-          <w:rFonts w:asciiTheme="majorBidi" w:hAnsiTheme="majorBidi" w:cstheme="majorBidi"/>
-        </w:rPr>
-        <w:t xml:space="preserve"> Risk Management &amp; Mitigation (RMP®)  </w:t>
-      </w:r>
-    </w:p>
-    <w:p>
-      <w:pPr>
-        <w:spacing w:line="240" w:lineRule="auto"/>
-        <w:rPr>
-          <w:rFonts w:asciiTheme="majorBidi" w:hAnsiTheme="majorBidi" w:cstheme="majorBidi"/>
-        </w:rPr>
-      </w:pPr>
-      <w:r>
-        <w:rPr>
-          <w:rFonts w:asciiTheme="majorBidi" w:hAnsiTheme="majorBidi" w:cstheme="majorBidi"/>
-        </w:rPr>
-        <w:t xml:space="preserve"> Project &amp; Program Management (PMP®)  </w:t>
-      </w:r>
-    </w:p>
-    <w:p>
-      <w:pPr>
-        <w:spacing w:line="240" w:lineRule="auto"/>
-        <w:rPr>
-          <w:rFonts w:asciiTheme="majorBidi" w:hAnsiTheme="majorBidi" w:cstheme="majorBidi"/>
-        </w:rPr>
-      </w:pPr>
-      <w:r>
-        <w:rPr>
-          <w:rFonts w:asciiTheme="majorBidi" w:hAnsiTheme="majorBidi" w:cstheme="majorBidi"/>
-        </w:rPr>
-        <w:t xml:space="preserve"> Vendor &amp; SLA/WLA Governance  </w:t>
-      </w:r>
-    </w:p>
-    <w:p>
-      <w:pPr>
-        <w:spacing w:line="240" w:lineRule="auto"/>
-        <w:rPr>
-          <w:rFonts w:asciiTheme="majorBidi" w:hAnsiTheme="majorBidi" w:cstheme="majorBidi"/>
-        </w:rPr>
-      </w:pPr>
-      <w:r>
-        <w:rPr>
-          <w:rFonts w:asciiTheme="majorBidi" w:hAnsiTheme="majorBidi" w:cstheme="majorBidi"/>
-        </w:rPr>
-        <w:t xml:space="preserve"> Warehouse &amp; Inventory Process Improvement  </w:t>
-      </w:r>
-    </w:p>
-    <w:p>
-      <w:pPr>
-        <w:spacing w:line="240" w:lineRule="auto"/>
-        <w:rPr>
-          <w:rFonts w:asciiTheme="majorBidi" w:hAnsiTheme="majorBidi" w:cstheme="majorBidi"/>
-        </w:rPr>
-      </w:pPr>
-      <w:r>
-        <w:rPr>
-          <w:rFonts w:asciiTheme="majorBidi" w:hAnsiTheme="majorBidi" w:cstheme="majorBidi"/>
-        </w:rPr>
-        <w:t xml:space="preserve"> Business Systems &amp; Process Optimization  </w:t>
-      </w:r>
-    </w:p>
-    <w:p>
-      <w:pPr>
-        <w:spacing w:line="240" w:lineRule="auto"/>
+      </w:pPr>
+      <w:r>
         <w:rPr>
           <w:rFonts w:asciiTheme="majorBidi" w:hAnsiTheme="majorBidi" w:cstheme="majorBidi"/>
           <w:b/>
@@ -340,8 +578,134 @@
           <w:sz w:val="28"/>
           <w:szCs w:val="28"/>
         </w:rPr>
-      </w:pPr>
-      <w:r>
+        <w:t xml:space="preserve">Program Coordinator — Managed Services (STC) / SPOC  </w:t>
+      </w:r>
+    </w:p>
+    <w:p>
+      <w:pPr>
+        <w:spacing w:line="240" w:lineRule="auto"/>
+        <w:rPr>
+          <w:rFonts w:asciiTheme="majorBidi" w:hAnsiTheme="majorBidi" w:cstheme="majorBidi"/>
+        </w:rPr>
+      </w:pPr>
+      <w:r>
+        <w:rPr>
+          <w:rFonts w:asciiTheme="majorBidi" w:hAnsiTheme="majorBidi" w:cstheme="majorBidi"/>
+        </w:rPr>
+        <w:t xml:space="preserve">Ericsson BSA | Jeddah, Saudi Arabia — Jan 2014 – July 2022  </w:t>
+      </w:r>
+    </w:p>
+    <w:p>
+      <w:pPr>
+        <w:spacing w:line="240" w:lineRule="auto"/>
+        <w:rPr>
+          <w:rFonts w:asciiTheme="majorBidi" w:hAnsiTheme="majorBidi" w:cstheme="majorBidi"/>
+        </w:rPr>
+      </w:pPr>
+      <w:r>
+        <w:rPr>
+          <w:rFonts w:asciiTheme="majorBidi" w:hAnsiTheme="majorBidi" w:cstheme="majorBidi"/>
+        </w:rPr>
+        <w:t xml:space="preserve">Single Point of Contact for one of the largest telecom managed services contracts in the Middle East.  </w:t>
+      </w:r>
+    </w:p>
+    <w:p>
+      <w:pPr>
+        <w:spacing w:line="240" w:lineRule="auto"/>
+        <w:rPr>
+          <w:rFonts w:asciiTheme="majorBidi" w:hAnsiTheme="majorBidi" w:cstheme="majorBidi"/>
+        </w:rPr>
+      </w:pPr>
+      <w:r>
+        <w:rPr>
+          <w:rFonts w:asciiTheme="majorBidi" w:hAnsiTheme="majorBidi" w:cstheme="majorBidi"/>
+        </w:rPr>
+        <w:t xml:space="preserve"> Saved SAR 100,000+/month by engineering a proactive SLA/WLA monitoring framework that prevented penalties.  </w:t>
+      </w:r>
+    </w:p>
+    <w:p>
+      <w:pPr>
+        <w:spacing w:line="240" w:lineRule="auto"/>
+        <w:rPr>
+          <w:rFonts w:asciiTheme="majorBidi" w:hAnsiTheme="majorBidi" w:cstheme="majorBidi"/>
+        </w:rPr>
+      </w:pPr>
+      <w:r>
+        <w:rPr>
+          <w:rFonts w:asciiTheme="majorBidi" w:hAnsiTheme="majorBidi" w:cstheme="majorBidi"/>
+        </w:rPr>
+        <w:t xml:space="preserve"> Founding operational lead who built the full vendor ecosystem (10+ ASPs/DSPs) from zero.  </w:t>
+      </w:r>
+    </w:p>
+    <w:p>
+      <w:pPr>
+        <w:spacing w:line="240" w:lineRule="auto"/>
+        <w:rPr>
+          <w:rFonts w:asciiTheme="majorBidi" w:hAnsiTheme="majorBidi" w:cstheme="majorBidi"/>
+        </w:rPr>
+      </w:pPr>
+      <w:r>
+        <w:rPr>
+          <w:rFonts w:asciiTheme="majorBidi" w:hAnsiTheme="majorBidi" w:cstheme="majorBidi"/>
+        </w:rPr>
+        <w:t xml:space="preserve"> Led multisite migration of STC hardware facilities into Ericsson</w:t>
+      </w:r>
+      <w:r>
+        <w:rPr>
+          <w:rFonts w:asciiTheme="majorBidi" w:hAnsiTheme="majorBidi" w:cstheme="majorBidi"/>
+        </w:rPr>
+        <w:t xml:space="preserve"> </w:t>
+      </w:r>
+      <w:r>
+        <w:rPr>
+          <w:rFonts w:asciiTheme="majorBidi" w:hAnsiTheme="majorBidi" w:cstheme="majorBidi"/>
+        </w:rPr>
+        <w:t xml:space="preserve">managed warehouses with zero disruption.  </w:t>
+      </w:r>
+    </w:p>
+    <w:p>
+      <w:pPr>
+        <w:spacing w:line="240" w:lineRule="auto"/>
+        <w:rPr>
+          <w:rFonts w:asciiTheme="majorBidi" w:hAnsiTheme="majorBidi" w:cstheme="majorBidi"/>
+        </w:rPr>
+      </w:pPr>
+      <w:r>
+        <w:rPr>
+          <w:rFonts w:asciiTheme="majorBidi" w:hAnsiTheme="majorBidi" w:cstheme="majorBidi"/>
+        </w:rPr>
+        <w:t xml:space="preserve"> Designed all program documentation, policies, and training materials used across regions.  </w:t>
+      </w:r>
+    </w:p>
+    <w:p>
+      <w:pPr>
+        <w:spacing w:line="240" w:lineRule="auto"/>
+        <w:rPr>
+          <w:rFonts w:asciiTheme="majorBidi" w:hAnsiTheme="majorBidi" w:cstheme="majorBidi"/>
+        </w:rPr>
+      </w:pPr>
+      <w:r>
+        <w:rPr>
+          <w:rFonts w:asciiTheme="majorBidi" w:hAnsiTheme="majorBidi" w:cstheme="majorBidi"/>
+        </w:rPr>
+        <w:t xml:space="preserve"> Established WLAs across cross</w:t>
+      </w:r>
+      <w:r>
+        <w:rPr>
+          <w:rFonts w:asciiTheme="majorBidi" w:hAnsiTheme="majorBidi" w:cstheme="majorBidi"/>
+        </w:rPr>
+        <w:t xml:space="preserve"> </w:t>
+      </w:r>
+      <w:r>
+        <w:rPr>
+          <w:rFonts w:asciiTheme="majorBidi" w:hAnsiTheme="majorBidi" w:cstheme="majorBidi"/>
+        </w:rPr>
+        <w:t>functional teams and conducted regular risk assessments.</w:t>
+      </w:r>
+    </w:p>
+    <w:p>
+      <w:pPr>
+        <w:spacing w:line="240" w:lineRule="auto"/>
         <w:rPr>
           <w:rFonts w:asciiTheme="majorBidi" w:hAnsiTheme="majorBidi" w:cstheme="majorBidi"/>
           <w:b/>
@@ -349,253 +713,8 @@
           <w:sz w:val="28"/>
           <w:szCs w:val="28"/>
         </w:rPr>
-        <w:t>Professional Experience</w:t>
-      </w:r>
-    </w:p>
-    <w:p>
-      <w:pPr>
-        <w:spacing w:line="240" w:lineRule="auto"/>
-        <w:rPr>
-          <w:rFonts w:asciiTheme="majorBidi" w:hAnsiTheme="majorBidi" w:cstheme="majorBidi"/>
-          <w:b/>
-          <w:bCs/>
-          <w:sz w:val="24"/>
-          <w:szCs w:val="24"/>
-        </w:rPr>
-      </w:pPr>
-      <w:r>
-        <w:rPr>
-          <w:rFonts w:asciiTheme="majorBidi" w:hAnsiTheme="majorBidi" w:cstheme="majorBidi"/>
-          <w:b/>
-          <w:bCs/>
-          <w:sz w:val="24"/>
-          <w:szCs w:val="24"/>
-        </w:rPr>
-        <w:t xml:space="preserve">Supply Chain Manager  </w:t>
-      </w:r>
-    </w:p>
-    <w:p>
-      <w:pPr>
-        <w:spacing w:line="240" w:lineRule="auto"/>
-        <w:rPr>
-          <w:rFonts w:asciiTheme="majorBidi" w:hAnsiTheme="majorBidi" w:cstheme="majorBidi"/>
-          <w:sz w:val="24"/>
-          <w:szCs w:val="24"/>
-        </w:rPr>
-      </w:pPr>
-      <w:r>
-        <w:rPr>
-          <w:rFonts w:asciiTheme="majorBidi" w:hAnsiTheme="majorBidi" w:cstheme="majorBidi"/>
-          <w:sz w:val="24"/>
-          <w:szCs w:val="24"/>
-        </w:rPr>
-        <w:t xml:space="preserve">Blue Light LLC | Lahore, Pakistan — November 2022 – May 2026  </w:t>
-      </w:r>
-    </w:p>
-    <w:p>
-      <w:pPr>
-        <w:spacing w:after="0" w:line="240" w:lineRule="auto"/>
-        <w:rPr>
-          <w:rFonts w:asciiTheme="majorBidi" w:eastAsia="Times New Roman" w:hAnsiTheme="majorBidi" w:cstheme="majorBidi"/>
-        </w:rPr>
-      </w:pPr>
-      <w:r>
-        <w:rPr>
-          <w:rFonts w:asciiTheme="majorBidi" w:eastAsia="Times New Roman" w:hAnsiTheme="majorBidi" w:cstheme="majorBidi"/>
-          <w:b/>
-          <w:bCs/>
-        </w:rPr>
-        <w:t>Transformed</w:t>
-      </w:r>
-      <w:r>
-        <w:rPr>
-          <w:rFonts w:asciiTheme="majorBidi" w:eastAsia="Times New Roman" w:hAnsiTheme="majorBidi" w:cstheme="majorBidi"/>
-        </w:rPr>
-        <w:t xml:space="preserve"> a manual, fragmented supply chain into a fully documented, scalable operation, establishing the company’s first end-to-end operational playbook. </w:t>
-      </w:r>
-    </w:p>
-    <w:p>
-      <w:pPr>
-        <w:spacing w:after="0" w:line="240" w:lineRule="auto"/>
-        <w:rPr>
-          <w:rFonts w:asciiTheme="majorBidi" w:eastAsia="Times New Roman" w:hAnsiTheme="majorBidi" w:cstheme="majorBidi"/>
-        </w:rPr>
-      </w:pPr>
-      <w:r>
-        <w:rPr>
-          <w:rFonts w:asciiTheme="majorBidi" w:eastAsia="Times New Roman" w:hAnsiTheme="majorBidi" w:cstheme="majorBidi"/>
-          <w:b/>
-          <w:bCs/>
-        </w:rPr>
-        <w:t>Achieved 50% reduction</w:t>
-      </w:r>
-      <w:r>
-        <w:rPr>
-          <w:rFonts w:asciiTheme="majorBidi" w:eastAsia="Times New Roman" w:hAnsiTheme="majorBidi" w:cstheme="majorBidi"/>
-        </w:rPr>
-        <w:t xml:space="preserve"> in average delivery cycle time and </w:t>
-      </w:r>
-      <w:r>
-        <w:rPr>
-          <w:rFonts w:asciiTheme="majorBidi" w:eastAsia="Times New Roman" w:hAnsiTheme="majorBidi" w:cstheme="majorBidi"/>
-          <w:b/>
-          <w:bCs/>
-        </w:rPr>
-        <w:t>20% cost savings</w:t>
-      </w:r>
-      <w:r>
-        <w:rPr>
-          <w:rFonts w:asciiTheme="majorBidi" w:eastAsia="Times New Roman" w:hAnsiTheme="majorBidi" w:cstheme="majorBidi"/>
-        </w:rPr>
-        <w:t xml:space="preserve"> per shipment by redesigning FedEx logistics workflows, renegotiating carrier contracts, and implementing route optimization. </w:t>
-      </w:r>
-    </w:p>
-    <w:p>
-      <w:pPr>
-        <w:spacing w:after="0" w:line="240" w:lineRule="auto"/>
-        <w:rPr>
-          <w:rFonts w:asciiTheme="majorBidi" w:eastAsia="Times New Roman" w:hAnsiTheme="majorBidi" w:cstheme="majorBidi"/>
-        </w:rPr>
-      </w:pPr>
-      <w:r>
-        <w:rPr>
-          <w:rFonts w:asciiTheme="majorBidi" w:eastAsia="Times New Roman" w:hAnsiTheme="majorBidi" w:cstheme="majorBidi"/>
-          <w:b/>
-          <w:bCs/>
-        </w:rPr>
-        <w:t>Drove customer claims down</w:t>
-      </w:r>
-      <w:r>
-        <w:rPr>
-          <w:rFonts w:asciiTheme="majorBidi" w:eastAsia="Times New Roman" w:hAnsiTheme="majorBidi" w:cstheme="majorBidi"/>
-        </w:rPr>
-        <w:t xml:space="preserve"> from multiple per quarter to ~1 per quarter through systematic compliance tracking, root-cause analysis, and proactive resolution frameworks. </w:t>
-      </w:r>
-    </w:p>
-    <w:p>
-      <w:pPr>
-        <w:spacing w:after="0" w:line="240" w:lineRule="auto"/>
-        <w:rPr>
-          <w:rFonts w:asciiTheme="majorBidi" w:eastAsia="Times New Roman" w:hAnsiTheme="majorBidi" w:cstheme="majorBidi"/>
-        </w:rPr>
-      </w:pPr>
-      <w:r>
-        <w:rPr>
-          <w:rFonts w:asciiTheme="majorBidi" w:eastAsia="Times New Roman" w:hAnsiTheme="majorBidi" w:cstheme="majorBidi"/>
-          <w:b/>
-          <w:bCs/>
-        </w:rPr>
-        <w:t>Architected and deployed</w:t>
-      </w:r>
-      <w:r>
-        <w:rPr>
-          <w:rFonts w:asciiTheme="majorBidi" w:eastAsia="Times New Roman" w:hAnsiTheme="majorBidi" w:cstheme="majorBidi"/>
-        </w:rPr>
-        <w:t xml:space="preserve"> a custom Google Sheets-based WMS with automated order-to-cash workflows (invoicing, packing slips, shipping labels, and email notifications). </w:t>
-      </w:r>
-    </w:p>
-    <w:p>
-      <w:pPr>
-        <w:spacing w:after="0" w:line="240" w:lineRule="auto"/>
-        <w:rPr>
-          <w:rFonts w:asciiTheme="majorBidi" w:eastAsia="Times New Roman" w:hAnsiTheme="majorBidi" w:cstheme="majorBidi"/>
-        </w:rPr>
-      </w:pPr>
-      <w:r>
-        <w:rPr>
-          <w:rFonts w:asciiTheme="majorBidi" w:eastAsia="Times New Roman" w:hAnsiTheme="majorBidi" w:cstheme="majorBidi"/>
-          <w:b/>
-          <w:bCs/>
-        </w:rPr>
-        <w:lastRenderedPageBreak/>
-        <w:t>Designed supplier scorecards</w:t>
-      </w:r>
-      <w:r>
-        <w:rPr>
-          <w:rFonts w:asciiTheme="majorBidi" w:eastAsia="Times New Roman" w:hAnsiTheme="majorBidi" w:cstheme="majorBidi"/>
-        </w:rPr>
-        <w:t xml:space="preserve"> and demand-driven reorder planning that eliminated chronic stock-outs and significantly improved OTIF (On-Time In-Full) performance. </w:t>
-      </w:r>
-    </w:p>
-    <w:p>
-      <w:pPr>
-        <w:spacing w:line="240" w:lineRule="auto"/>
-        <w:rPr>
-          <w:rFonts w:asciiTheme="majorBidi" w:eastAsia="Times New Roman" w:hAnsiTheme="majorBidi" w:cstheme="majorBidi"/>
-        </w:rPr>
-      </w:pPr>
-      <w:r>
-        <w:rPr>
-          <w:rFonts w:asciiTheme="majorBidi" w:eastAsia="Times New Roman" w:hAnsiTheme="majorBidi" w:cstheme="majorBidi"/>
-          <w:b/>
-          <w:bCs/>
-        </w:rPr>
-        <w:t>Managed full supply chain P&amp;L</w:t>
-      </w:r>
-      <w:r>
-        <w:rPr>
-          <w:rFonts w:asciiTheme="majorBidi" w:eastAsia="Times New Roman" w:hAnsiTheme="majorBidi" w:cstheme="majorBidi"/>
-        </w:rPr>
-        <w:t xml:space="preserve">, including </w:t>
-      </w:r>
-      <w:r>
-        <w:rPr>
-          <w:rFonts w:asciiTheme="majorBidi" w:eastAsia="Times New Roman" w:hAnsiTheme="majorBidi" w:cstheme="majorBidi"/>
-        </w:rPr>
-        <w:t>10M</w:t>
-      </w:r>
-      <w:r>
-        <w:rPr>
-          <w:rFonts w:asciiTheme="majorBidi" w:eastAsia="Times New Roman" w:hAnsiTheme="majorBidi" w:cstheme="majorBidi"/>
-        </w:rPr>
-        <w:t>+</w:t>
-      </w:r>
-      <w:r>
-        <w:rPr>
-          <w:rFonts w:asciiTheme="majorBidi" w:eastAsia="Times New Roman" w:hAnsiTheme="majorBidi" w:cstheme="majorBidi"/>
-        </w:rPr>
-        <w:t xml:space="preserve"> Logistics and Procurement budget</w:t>
-      </w:r>
-      <w:r>
-        <w:rPr>
-          <w:rFonts w:asciiTheme="majorBidi" w:eastAsia="Times New Roman" w:hAnsiTheme="majorBidi" w:cstheme="majorBidi"/>
-        </w:rPr>
-        <w:t xml:space="preserve"> - leading</w:t>
-      </w:r>
-      <w:r>
-        <w:rPr>
-          <w:rFonts w:asciiTheme="majorBidi" w:eastAsia="Times New Roman" w:hAnsiTheme="majorBidi" w:cstheme="majorBidi"/>
-        </w:rPr>
-        <w:t xml:space="preserve"> </w:t>
-      </w:r>
-      <w:r>
-        <w:rPr>
-          <w:rFonts w:asciiTheme="majorBidi" w:eastAsia="Times New Roman" w:hAnsiTheme="majorBidi" w:cstheme="majorBidi"/>
-        </w:rPr>
-        <w:t xml:space="preserve">vendor negotiations </w:t>
-      </w:r>
-      <w:r>
-        <w:rPr>
-          <w:rFonts w:asciiTheme="majorBidi" w:eastAsia="Times New Roman" w:hAnsiTheme="majorBidi" w:cstheme="majorBidi"/>
-        </w:rPr>
-        <w:t>and cro</w:t>
-      </w:r>
-      <w:r>
-        <w:rPr>
-          <w:rFonts w:asciiTheme="majorBidi" w:eastAsia="Times New Roman" w:hAnsiTheme="majorBidi" w:cstheme="majorBidi"/>
-        </w:rPr>
-        <w:t>ss-functional team development -</w:t>
-      </w:r>
-      <w:r>
-        <w:rPr>
-          <w:rFonts w:asciiTheme="majorBidi" w:eastAsia="Times New Roman" w:hAnsiTheme="majorBidi" w:cstheme="majorBidi"/>
-        </w:rPr>
-        <w:t xml:space="preserve"> consistently meeting cost and service KPIs.</w:t>
-      </w:r>
-    </w:p>
-    <w:p>
-      <w:pPr>
-        <w:spacing w:line="240" w:lineRule="auto"/>
+      </w:pPr>
+      <w:r>
         <w:rPr>
           <w:rFonts w:asciiTheme="majorBidi" w:hAnsiTheme="majorBidi" w:cstheme="majorBidi"/>
           <w:b/>
@@ -603,234 +722,81 @@
           <w:sz w:val="28"/>
           <w:szCs w:val="28"/>
         </w:rPr>
-      </w:pPr>
-      <w:r>
-        <w:rPr>
-          <w:rFonts w:asciiTheme="majorBidi" w:hAnsiTheme="majorBidi" w:cstheme="majorBidi"/>
-          <w:b/>
-          <w:bCs/>
+        <w:t xml:space="preserve">Hardware Services Coordinator &amp; OHS Program Lead  </w:t>
+      </w:r>
+    </w:p>
+    <w:p>
+      <w:pPr>
+        <w:spacing w:line="240" w:lineRule="auto"/>
+        <w:rPr>
+          <w:rFonts w:asciiTheme="majorBidi" w:hAnsiTheme="majorBidi" w:cstheme="majorBidi"/>
+        </w:rPr>
+      </w:pPr>
+      <w:r>
+        <w:rPr>
+          <w:rFonts w:asciiTheme="majorBidi" w:hAnsiTheme="majorBidi" w:cstheme="majorBidi"/>
+        </w:rPr>
+        <w:t xml:space="preserve">Ericsson BSA | Jeddah, Saudi Arabia — December 2010 – December 2013  </w:t>
+      </w:r>
+    </w:p>
+    <w:p>
+      <w:pPr>
+        <w:spacing w:line="240" w:lineRule="auto"/>
+        <w:rPr>
+          <w:rFonts w:asciiTheme="majorBidi" w:hAnsiTheme="majorBidi" w:cstheme="majorBidi"/>
+        </w:rPr>
+      </w:pPr>
+      <w:r>
+        <w:rPr>
+          <w:rFonts w:asciiTheme="majorBidi" w:hAnsiTheme="majorBidi" w:cstheme="majorBidi"/>
+        </w:rPr>
+        <w:t xml:space="preserve"> Managed hardware lifecycle and spare parts operations across KSA regions.  </w:t>
+      </w:r>
+    </w:p>
+    <w:p>
+      <w:pPr>
+        <w:spacing w:line="240" w:lineRule="auto"/>
+        <w:rPr>
+          <w:rFonts w:asciiTheme="majorBidi" w:hAnsiTheme="majorBidi" w:cstheme="majorBidi"/>
+        </w:rPr>
+      </w:pPr>
+      <w:r>
+        <w:rPr>
+          <w:rFonts w:asciiTheme="majorBidi" w:hAnsiTheme="majorBidi" w:cstheme="majorBidi"/>
+        </w:rPr>
+        <w:t xml:space="preserve"> Pioneered OHS compliance rollout across all authorized service providers with measurable safety improvements.  </w:t>
+      </w:r>
+    </w:p>
+    <w:p>
+      <w:pPr>
+        <w:spacing w:line="240" w:lineRule="auto"/>
+        <w:rPr>
+          <w:rFonts w:asciiTheme="majorBidi" w:hAnsiTheme="majorBidi" w:cstheme="majorBidi"/>
+        </w:rPr>
+      </w:pPr>
+      <w:r>
+        <w:rPr>
+          <w:rFonts w:asciiTheme="majorBidi" w:hAnsiTheme="majorBidi" w:cstheme="majorBidi"/>
+        </w:rPr>
+        <w:t xml:space="preserve"> Optimized warehouse processes and asset traceability.</w:t>
+      </w:r>
+    </w:p>
+    <w:p>
+      <w:pPr>
+        <w:pStyle w:val="NormalWeb"/>
+        <w:rPr>
+          <w:rFonts w:asciiTheme="majorBidi" w:hAnsiTheme="majorBidi" w:cstheme="majorBidi"/>
           <w:sz w:val="28"/>
           <w:szCs w:val="28"/>
         </w:rPr>
-        <w:t xml:space="preserve">Program Coordinator — Managed Services (STC) / SPOC  </w:t>
-      </w:r>
-    </w:p>
-    <w:p>
-      <w:pPr>
-        <w:spacing w:line="240" w:lineRule="auto"/>
-        <w:rPr>
-          <w:rFonts w:asciiTheme="majorBidi" w:hAnsiTheme="majorBidi" w:cstheme="majorBidi"/>
-        </w:rPr>
-      </w:pPr>
-      <w:r>
-        <w:rPr>
-          <w:rFonts w:asciiTheme="majorBidi" w:hAnsiTheme="majorBidi" w:cstheme="majorBidi"/>
-        </w:rPr>
-        <w:t xml:space="preserve">Ericsson BSA | Jeddah, Saudi Arabia — Jan 2014 – July 2022  </w:t>
-      </w:r>
-    </w:p>
-    <w:p>
-      <w:pPr>
-        <w:spacing w:line="240" w:lineRule="auto"/>
-        <w:rPr>
-          <w:rFonts w:asciiTheme="majorBidi" w:hAnsiTheme="majorBidi" w:cstheme="majorBidi"/>
-        </w:rPr>
-      </w:pPr>
-      <w:r>
-        <w:rPr>
-          <w:rFonts w:asciiTheme="majorBidi" w:hAnsiTheme="majorBidi" w:cstheme="majorBidi"/>
-        </w:rPr>
-        <w:t xml:space="preserve">Single Point of Contact for one of the largest telecom managed services contracts in the Middle East.  </w:t>
-      </w:r>
-    </w:p>
-    <w:p>
-      <w:pPr>
-        <w:spacing w:line="240" w:lineRule="auto"/>
-        <w:rPr>
-          <w:rFonts w:asciiTheme="majorBidi" w:hAnsiTheme="majorBidi" w:cstheme="majorBidi"/>
-        </w:rPr>
-      </w:pPr>
-      <w:r>
-        <w:rPr>
-          <w:rFonts w:asciiTheme="majorBidi" w:hAnsiTheme="majorBidi" w:cstheme="majorBidi"/>
-        </w:rPr>
-        <w:t xml:space="preserve"> Saved SAR 100,000+/month by engineering a proactive SLA/WLA monitoring framework that prevented penalties.  </w:t>
-      </w:r>
-    </w:p>
-    <w:p>
-      <w:pPr>
-        <w:spacing w:line="240" w:lineRule="auto"/>
-        <w:rPr>
-          <w:rFonts w:asciiTheme="majorBidi" w:hAnsiTheme="majorBidi" w:cstheme="majorBidi"/>
-        </w:rPr>
-      </w:pPr>
-      <w:r>
-        <w:rPr>
-          <w:rFonts w:asciiTheme="majorBidi" w:hAnsiTheme="majorBidi" w:cstheme="majorBidi"/>
-        </w:rPr>
-        <w:t xml:space="preserve"> Founding operational lead who built the full vendor ecosystem (10+ ASPs/DSPs) from zero.  </w:t>
-      </w:r>
-    </w:p>
-    <w:p>
-      <w:pPr>
-        <w:spacing w:line="240" w:lineRule="auto"/>
-        <w:rPr>
-          <w:rFonts w:asciiTheme="majorBidi" w:hAnsiTheme="majorBidi" w:cstheme="majorBidi"/>
-        </w:rPr>
-      </w:pPr>
-      <w:r>
-        <w:rPr>
-          <w:rFonts w:asciiTheme="majorBidi" w:hAnsiTheme="majorBidi" w:cstheme="majorBidi"/>
-        </w:rPr>
-        <w:t xml:space="preserve"> Led multisite migration of STC hardware facilities into Ericsson</w:t>
-      </w:r>
-      <w:r>
-        <w:rPr>
-          <w:rFonts w:asciiTheme="majorBidi" w:hAnsiTheme="majorBidi" w:cstheme="majorBidi"/>
-        </w:rPr>
-        <w:t xml:space="preserve"> </w:t>
-      </w:r>
-      <w:r>
-        <w:rPr>
-          <w:rFonts w:asciiTheme="majorBidi" w:hAnsiTheme="majorBidi" w:cstheme="majorBidi"/>
-        </w:rPr>
-        <w:t xml:space="preserve">managed warehouses with zero disruption.  </w:t>
-      </w:r>
-    </w:p>
-    <w:p>
-      <w:pPr>
-        <w:spacing w:line="240" w:lineRule="auto"/>
-        <w:rPr>
-          <w:rFonts w:asciiTheme="majorBidi" w:hAnsiTheme="majorBidi" w:cstheme="majorBidi"/>
-        </w:rPr>
-      </w:pPr>
-      <w:r>
-        <w:rPr>
-          <w:rFonts w:asciiTheme="majorBidi" w:hAnsiTheme="majorBidi" w:cstheme="majorBidi"/>
-        </w:rPr>
-        <w:t xml:space="preserve"> Designed all program documentation, policies, and training materials used across regions.  </w:t>
-      </w:r>
-    </w:p>
-    <w:p>
-      <w:pPr>
-        <w:spacing w:line="240" w:lineRule="auto"/>
-        <w:rPr>
-          <w:rFonts w:asciiTheme="majorBidi" w:hAnsiTheme="majorBidi" w:cstheme="majorBidi"/>
-        </w:rPr>
-      </w:pPr>
-      <w:r>
-        <w:rPr>
-          <w:rFonts w:asciiTheme="majorBidi" w:hAnsiTheme="majorBidi" w:cstheme="majorBidi"/>
-        </w:rPr>
-        <w:t xml:space="preserve"> Established WLAs across cross</w:t>
-      </w:r>
-      <w:r>
-        <w:rPr>
-          <w:rFonts w:asciiTheme="majorBidi" w:hAnsiTheme="majorBidi" w:cstheme="majorBidi"/>
-        </w:rPr>
-        <w:t xml:space="preserve"> </w:t>
-      </w:r>
-      <w:r>
-        <w:rPr>
-          <w:rFonts w:asciiTheme="majorBidi" w:hAnsiTheme="majorBidi" w:cstheme="majorBidi"/>
-        </w:rPr>
-        <w:t>functional teams and conducted regular risk assessments.</w:t>
-      </w:r>
-    </w:p>
-    <w:p>
-      <w:pPr>
-        <w:spacing w:line="240" w:lineRule="auto"/>
-        <w:rPr>
-          <w:rFonts w:asciiTheme="majorBidi" w:hAnsiTheme="majorBidi" w:cstheme="majorBidi"/>
-          <w:b/>
-          <w:bCs/>
+      </w:pPr>
+      <w:r>
+        <w:rPr>
+          <w:rStyle w:val="Strong"/>
+          <w:rFonts w:asciiTheme="majorBidi" w:hAnsiTheme="majorBidi" w:cstheme="majorBidi"/>
           <w:sz w:val="28"/>
           <w:szCs w:val="28"/>
         </w:rPr>
-      </w:pPr>
-      <w:r>
-        <w:rPr>
-          <w:rFonts w:asciiTheme="majorBidi" w:hAnsiTheme="majorBidi" w:cstheme="majorBidi"/>
-          <w:b/>
-          <w:bCs/>
-          <w:sz w:val="28"/>
-          <w:szCs w:val="28"/>
-        </w:rPr>
-        <w:t xml:space="preserve">Hardware Services Coordinator &amp; OHS Program Lead  </w:t>
-      </w:r>
-    </w:p>
-    <w:p>
-      <w:pPr>
-        <w:spacing w:line="240" w:lineRule="auto"/>
-        <w:rPr>
-          <w:rFonts w:asciiTheme="majorBidi" w:hAnsiTheme="majorBidi" w:cstheme="majorBidi"/>
-        </w:rPr>
-      </w:pPr>
-      <w:r>
-        <w:rPr>
-          <w:rFonts w:asciiTheme="majorBidi" w:hAnsiTheme="majorBidi" w:cstheme="majorBidi"/>
-        </w:rPr>
-        <w:t xml:space="preserve">Ericsson BSA | Jeddah, Saudi Arabia — December 2010 – December 2013  </w:t>
-      </w:r>
-    </w:p>
-    <w:p>
-      <w:pPr>
-        <w:spacing w:line="240" w:lineRule="auto"/>
-        <w:rPr>
-          <w:rFonts w:asciiTheme="majorBidi" w:hAnsiTheme="majorBidi" w:cstheme="majorBidi"/>
-        </w:rPr>
-      </w:pPr>
-      <w:r>
-        <w:rPr>
-          <w:rFonts w:asciiTheme="majorBidi" w:hAnsiTheme="majorBidi" w:cstheme="majorBidi"/>
-        </w:rPr>
-        <w:t xml:space="preserve"> Managed hardware lifecycle and spare parts operations across KSA regions.  </w:t>
-      </w:r>
-    </w:p>
-    <w:p>
-      <w:pPr>
-        <w:spacing w:line="240" w:lineRule="auto"/>
-        <w:rPr>
-          <w:rFonts w:asciiTheme="majorBidi" w:hAnsiTheme="majorBidi" w:cstheme="majorBidi"/>
-        </w:rPr>
-      </w:pPr>
-      <w:r>
-        <w:rPr>
-          <w:rFonts w:asciiTheme="majorBidi" w:hAnsiTheme="majorBidi" w:cstheme="majorBidi"/>
-        </w:rPr>
-        <w:t xml:space="preserve"> Pioneered OHS compliance rollout across all authorized service providers with measurable safety improvements.  </w:t>
-      </w:r>
-    </w:p>
-    <w:p>
-      <w:pPr>
-        <w:spacing w:line="240" w:lineRule="auto"/>
-        <w:rPr>
-          <w:rFonts w:asciiTheme="majorBidi" w:hAnsiTheme="majorBidi" w:cstheme="majorBidi"/>
-        </w:rPr>
-      </w:pPr>
-      <w:r>
-        <w:rPr>
-          <w:rFonts w:asciiTheme="majorBidi" w:hAnsiTheme="majorBidi" w:cstheme="majorBidi"/>
-        </w:rPr>
-        <w:t xml:space="preserve"> Optimized warehouse processes and asset traceability.</w:t>
-      </w:r>
-    </w:p>
-    <w:p>
-      <w:pPr>
-        <w:pStyle w:val="NormalWeb"/>
-        <w:rPr>
-          <w:rFonts w:asciiTheme="majorBidi" w:hAnsiTheme="majorBidi" w:cstheme="majorBidi"/>
-          <w:sz w:val="28"/>
-          <w:szCs w:val="28"/>
-        </w:rPr>
-      </w:pPr>
-      <w:r>
-        <w:rPr>
-          <w:rStyle w:val="Strong"/>
-          <w:rFonts w:asciiTheme="majorBidi" w:hAnsiTheme="majorBidi" w:cstheme="majorBidi"/>
-          <w:sz w:val="28"/>
-          <w:szCs w:val="28"/>
-        </w:rPr>
         <w:t>Software Projects &amp; Digital Products</w:t>
       </w:r>
     </w:p>
@@ -1221,16 +1187,7 @@
         <w:t xml:space="preserve"> </w:t>
       </w:r>
       <w:r>
-        <w:t>built</w:t>
-      </w:r>
-      <w:r>
-        <w:t xml:space="preserve"> a local, tool-calling AI agent (</w:t>
-      </w:r>
-      <w:r>
-        <w:t>LangGraph</w:t>
-      </w:r>
-      <w:r>
-        <w:t xml:space="preserve"> + Ollama) with live, read-only access to a production Postgres SCM/ERP database. Engineered deterministic fallback guardrails against hallucinated data and unverified citations, bounded execution with a hard iteration ceiling, and scoped retry logic distinguishing transient from permanent failures — not just prompt-level rules. Verified by a 22-test regression suite and an end-to-end harness separating deterministic guardrail checks from LLM-reasoning review, which has already caught real deployment gaps and guardrail coverage gaps under adversarial testing.</w:t>
+        <w:t>built a local, tool-calling AI agent (LangGraph + Ollama) with live, read-only access to a production Postgres SCM/ERP database. Engineered deterministic fallback guardrails against hallucinated data and unverified citations, bounded execution with a hard iteration ceiling, and scoped retry logic distinguishing transient from permanent failures — not just prompt-level rules. Verified by a 22-test regression suite and an end-to-end harness separating deterministic guardrail checks from LLM-reasoning review, which has already caught real deployment gaps and guardrail coverage gaps under adversarial testing.</w:t>
       </w:r>
     </w:p>
     <w:p>

</xml_diff>